<commit_message>
LMA data for R
</commit_message>
<xml_diff>
--- a/IDEAS SUELTAS.docx
+++ b/IDEAS SUELTAS.docx
@@ -203,6 +203,12 @@
     <w:p>
       <w:pPr>
         <w:rPr>
+          <w:rStyle w:val="eop"/>
+          <w:rFonts w:ascii="Calibri Light" w:hAnsi="Calibri Light" w:cs="Calibri Light"/>
+          <w:color w:val="000000"/>
+          <w:sz w:val="20"/>
+          <w:szCs w:val="20"/>
+          <w:shd w:val="clear" w:color="auto" w:fill="FFFFFF"/>
           <w:lang w:val="en-US"/>
         </w:rPr>
       </w:pPr>
@@ -310,8 +316,2209 @@
         </w:rPr>
         <w:t> </w:t>
       </w:r>
-      <w:bookmarkStart w:id="0" w:name="_GoBack"/>
-      <w:bookmarkEnd w:id="0"/>
+    </w:p>
+    <w:p>
+      <w:pPr>
+        <w:rPr>
+          <w:rStyle w:val="eop"/>
+          <w:rFonts w:ascii="Calibri Light" w:hAnsi="Calibri Light" w:cs="Calibri Light"/>
+          <w:color w:val="000000"/>
+          <w:sz w:val="20"/>
+          <w:szCs w:val="20"/>
+          <w:shd w:val="clear" w:color="auto" w:fill="FFFFFF"/>
+          <w:lang w:val="en-US"/>
+        </w:rPr>
+      </w:pPr>
+    </w:p>
+    <w:p>
+      <w:pPr>
+        <w:spacing w:before="100" w:beforeAutospacing="1" w:after="100" w:afterAutospacing="1" w:line="240" w:lineRule="auto"/>
+        <w:outlineLvl w:val="2"/>
+        <w:rPr>
+          <w:rFonts w:ascii="Times New Roman" w:eastAsia="Times New Roman" w:hAnsi="Times New Roman" w:cs="Times New Roman"/>
+          <w:b/>
+          <w:bCs/>
+          <w:sz w:val="27"/>
+          <w:szCs w:val="27"/>
+        </w:rPr>
+      </w:pPr>
+      <w:r>
+        <w:rPr>
+          <w:rFonts w:ascii="Times New Roman" w:eastAsia="Times New Roman" w:hAnsi="Times New Roman" w:cs="Times New Roman"/>
+          <w:b/>
+          <w:bCs/>
+          <w:sz w:val="27"/>
+          <w:szCs w:val="27"/>
+        </w:rPr>
+        <w:t>Tabla resumen (24 comparaciones: 6 especies × 4 rasgos)</w:t>
+      </w:r>
+    </w:p>
+    <w:tbl>
+      <w:tblPr>
+        <w:tblpPr w:leftFromText="180" w:rightFromText="180" w:vertAnchor="text" w:tblpY="1"/>
+        <w:tblOverlap w:val="never"/>
+        <w:tblW w:w="0" w:type="auto"/>
+        <w:tblCellSpacing w:w="15" w:type="dxa"/>
+        <w:tblCellMar>
+          <w:top w:w="15" w:type="dxa"/>
+          <w:left w:w="15" w:type="dxa"/>
+          <w:bottom w:w="15" w:type="dxa"/>
+          <w:right w:w="15" w:type="dxa"/>
+        </w:tblCellMar>
+        <w:tblLook w:val="04A0" w:firstRow="1" w:lastRow="0" w:firstColumn="1" w:lastColumn="0" w:noHBand="0" w:noVBand="1"/>
+      </w:tblPr>
+      <w:tblGrid>
+        <w:gridCol w:w="1302"/>
+        <w:gridCol w:w="2059"/>
+        <w:gridCol w:w="1149"/>
+        <w:gridCol w:w="703"/>
+        <w:gridCol w:w="913"/>
+        <w:gridCol w:w="1251"/>
+        <w:gridCol w:w="1461"/>
+      </w:tblGrid>
+      <w:tr>
+        <w:trPr>
+          <w:tblHeader/>
+          <w:tblCellSpacing w:w="15" w:type="dxa"/>
+        </w:trPr>
+        <w:tc>
+          <w:tcPr>
+            <w:tcW w:w="0" w:type="auto"/>
+            <w:vAlign w:val="center"/>
+            <w:hideMark/>
+          </w:tcPr>
+          <w:p>
+            <w:pPr>
+              <w:spacing w:after="0" w:line="240" w:lineRule="auto"/>
+              <w:jc w:val="center"/>
+              <w:rPr>
+                <w:rFonts w:ascii="Times New Roman" w:eastAsia="Times New Roman" w:hAnsi="Times New Roman" w:cs="Times New Roman"/>
+                <w:b/>
+                <w:bCs/>
+                <w:sz w:val="24"/>
+                <w:szCs w:val="24"/>
+                <w:lang w:val="en-US"/>
+              </w:rPr>
+            </w:pPr>
+            <w:proofErr w:type="spellStart"/>
+            <w:r>
+              <w:rPr>
+                <w:rFonts w:ascii="Times New Roman" w:eastAsia="Times New Roman" w:hAnsi="Times New Roman" w:cs="Times New Roman"/>
+                <w:b/>
+                <w:bCs/>
+                <w:sz w:val="24"/>
+                <w:szCs w:val="24"/>
+                <w:lang w:val="en-US"/>
+              </w:rPr>
+              <w:t>Especie</w:t>
+            </w:r>
+            <w:proofErr w:type="spellEnd"/>
+          </w:p>
+        </w:tc>
+        <w:tc>
+          <w:tcPr>
+            <w:tcW w:w="0" w:type="auto"/>
+            <w:vAlign w:val="center"/>
+            <w:hideMark/>
+          </w:tcPr>
+          <w:p>
+            <w:pPr>
+              <w:spacing w:after="0" w:line="240" w:lineRule="auto"/>
+              <w:jc w:val="center"/>
+              <w:rPr>
+                <w:rFonts w:ascii="Times New Roman" w:eastAsia="Times New Roman" w:hAnsi="Times New Roman" w:cs="Times New Roman"/>
+                <w:b/>
+                <w:bCs/>
+                <w:sz w:val="24"/>
+                <w:szCs w:val="24"/>
+                <w:lang w:val="en-US"/>
+              </w:rPr>
+            </w:pPr>
+            <w:proofErr w:type="spellStart"/>
+            <w:r>
+              <w:rPr>
+                <w:rFonts w:ascii="Times New Roman" w:eastAsia="Times New Roman" w:hAnsi="Times New Roman" w:cs="Times New Roman"/>
+                <w:b/>
+                <w:bCs/>
+                <w:sz w:val="24"/>
+                <w:szCs w:val="24"/>
+                <w:lang w:val="en-US"/>
+              </w:rPr>
+              <w:t>Rasgo</w:t>
+            </w:r>
+            <w:proofErr w:type="spellEnd"/>
+          </w:p>
+        </w:tc>
+        <w:tc>
+          <w:tcPr>
+            <w:tcW w:w="0" w:type="auto"/>
+            <w:vAlign w:val="center"/>
+            <w:hideMark/>
+          </w:tcPr>
+          <w:p>
+            <w:pPr>
+              <w:spacing w:after="0" w:line="240" w:lineRule="auto"/>
+              <w:jc w:val="center"/>
+              <w:rPr>
+                <w:rFonts w:ascii="Times New Roman" w:eastAsia="Times New Roman" w:hAnsi="Times New Roman" w:cs="Times New Roman"/>
+                <w:b/>
+                <w:bCs/>
+                <w:sz w:val="24"/>
+                <w:szCs w:val="24"/>
+                <w:lang w:val="en-US"/>
+              </w:rPr>
+            </w:pPr>
+            <w:proofErr w:type="spellStart"/>
+            <w:r>
+              <w:rPr>
+                <w:rFonts w:ascii="Times New Roman" w:eastAsia="Times New Roman" w:hAnsi="Times New Roman" w:cs="Times New Roman"/>
+                <w:b/>
+                <w:bCs/>
+                <w:sz w:val="24"/>
+                <w:szCs w:val="24"/>
+                <w:lang w:val="en-US"/>
+              </w:rPr>
+              <w:t>ΔAICc</w:t>
+            </w:r>
+            <w:proofErr w:type="spellEnd"/>
+            <w:r>
+              <w:rPr>
+                <w:rFonts w:ascii="Times New Roman" w:eastAsia="Times New Roman" w:hAnsi="Times New Roman" w:cs="Times New Roman"/>
+                <w:b/>
+                <w:bCs/>
+                <w:sz w:val="24"/>
+                <w:szCs w:val="24"/>
+                <w:lang w:val="en-US"/>
+              </w:rPr>
+              <w:t xml:space="preserve"> (</w:t>
+            </w:r>
+            <w:proofErr w:type="spellStart"/>
+            <w:r>
+              <w:rPr>
+                <w:rFonts w:ascii="Times New Roman" w:eastAsia="Times New Roman" w:hAnsi="Times New Roman" w:cs="Times New Roman"/>
+                <w:b/>
+                <w:bCs/>
+                <w:sz w:val="24"/>
+                <w:szCs w:val="24"/>
+                <w:lang w:val="en-US"/>
+              </w:rPr>
+              <w:t>int</w:t>
+            </w:r>
+            <w:proofErr w:type="spellEnd"/>
+            <w:r>
+              <w:rPr>
+                <w:rFonts w:ascii="Times New Roman" w:eastAsia="Times New Roman" w:hAnsi="Times New Roman" w:cs="Times New Roman"/>
+                <w:b/>
+                <w:bCs/>
+                <w:sz w:val="24"/>
+                <w:szCs w:val="24"/>
+                <w:lang w:val="en-US"/>
+              </w:rPr>
+              <w:t xml:space="preserve"> − add)</w:t>
+            </w:r>
+          </w:p>
+        </w:tc>
+        <w:tc>
+          <w:tcPr>
+            <w:tcW w:w="0" w:type="auto"/>
+            <w:vAlign w:val="center"/>
+            <w:hideMark/>
+          </w:tcPr>
+          <w:p>
+            <w:pPr>
+              <w:spacing w:after="0" w:line="240" w:lineRule="auto"/>
+              <w:jc w:val="center"/>
+              <w:rPr>
+                <w:rFonts w:ascii="Times New Roman" w:eastAsia="Times New Roman" w:hAnsi="Times New Roman" w:cs="Times New Roman"/>
+                <w:b/>
+                <w:bCs/>
+                <w:sz w:val="24"/>
+                <w:szCs w:val="24"/>
+                <w:lang w:val="en-US"/>
+              </w:rPr>
+            </w:pPr>
+            <w:r>
+              <w:rPr>
+                <w:rFonts w:ascii="Times New Roman" w:eastAsia="Times New Roman" w:hAnsi="Times New Roman" w:cs="Times New Roman"/>
+                <w:b/>
+                <w:bCs/>
+                <w:sz w:val="24"/>
+                <w:szCs w:val="24"/>
+                <w:lang w:val="en-US"/>
+              </w:rPr>
+              <w:t>χ²</w:t>
+            </w:r>
+          </w:p>
+        </w:tc>
+        <w:tc>
+          <w:tcPr>
+            <w:tcW w:w="0" w:type="auto"/>
+            <w:vAlign w:val="center"/>
+            <w:hideMark/>
+          </w:tcPr>
+          <w:p>
+            <w:pPr>
+              <w:spacing w:after="0" w:line="240" w:lineRule="auto"/>
+              <w:jc w:val="center"/>
+              <w:rPr>
+                <w:rFonts w:ascii="Times New Roman" w:eastAsia="Times New Roman" w:hAnsi="Times New Roman" w:cs="Times New Roman"/>
+                <w:b/>
+                <w:bCs/>
+                <w:sz w:val="24"/>
+                <w:szCs w:val="24"/>
+                <w:lang w:val="en-US"/>
+              </w:rPr>
+            </w:pPr>
+            <w:r>
+              <w:rPr>
+                <w:rFonts w:ascii="Times New Roman" w:eastAsia="Times New Roman" w:hAnsi="Times New Roman" w:cs="Times New Roman"/>
+                <w:b/>
+                <w:bCs/>
+                <w:sz w:val="24"/>
+                <w:szCs w:val="24"/>
+                <w:lang w:val="en-US"/>
+              </w:rPr>
+              <w:t>p</w:t>
+            </w:r>
+          </w:p>
+        </w:tc>
+        <w:tc>
+          <w:tcPr>
+            <w:tcW w:w="0" w:type="auto"/>
+            <w:vAlign w:val="center"/>
+            <w:hideMark/>
+          </w:tcPr>
+          <w:p>
+            <w:pPr>
+              <w:spacing w:after="0" w:line="240" w:lineRule="auto"/>
+              <w:jc w:val="center"/>
+              <w:rPr>
+                <w:rFonts w:ascii="Times New Roman" w:eastAsia="Times New Roman" w:hAnsi="Times New Roman" w:cs="Times New Roman"/>
+                <w:b/>
+                <w:bCs/>
+                <w:sz w:val="24"/>
+                <w:szCs w:val="24"/>
+                <w:lang w:val="en-US"/>
+              </w:rPr>
+            </w:pPr>
+            <w:r>
+              <w:rPr>
+                <w:rFonts w:ascii="Times New Roman" w:eastAsia="Times New Roman" w:hAnsi="Times New Roman" w:cs="Times New Roman"/>
+                <w:b/>
+                <w:bCs/>
+                <w:sz w:val="24"/>
+                <w:szCs w:val="24"/>
+                <w:lang w:val="en-US"/>
+              </w:rPr>
+              <w:t xml:space="preserve">p </w:t>
+            </w:r>
+            <w:proofErr w:type="spellStart"/>
+            <w:r>
+              <w:rPr>
+                <w:rFonts w:ascii="Times New Roman" w:eastAsia="Times New Roman" w:hAnsi="Times New Roman" w:cs="Times New Roman"/>
+                <w:b/>
+                <w:bCs/>
+                <w:sz w:val="24"/>
+                <w:szCs w:val="24"/>
+                <w:lang w:val="en-US"/>
+              </w:rPr>
+              <w:t>ajustado</w:t>
+            </w:r>
+            <w:proofErr w:type="spellEnd"/>
+            <w:r>
+              <w:rPr>
+                <w:rFonts w:ascii="Times New Roman" w:eastAsia="Times New Roman" w:hAnsi="Times New Roman" w:cs="Times New Roman"/>
+                <w:b/>
+                <w:bCs/>
+                <w:sz w:val="24"/>
+                <w:szCs w:val="24"/>
+                <w:lang w:val="en-US"/>
+              </w:rPr>
+              <w:t xml:space="preserve"> (FDR)</w:t>
+            </w:r>
+          </w:p>
+        </w:tc>
+        <w:tc>
+          <w:tcPr>
+            <w:tcW w:w="0" w:type="auto"/>
+            <w:vAlign w:val="center"/>
+            <w:hideMark/>
+          </w:tcPr>
+          <w:p>
+            <w:pPr>
+              <w:spacing w:after="0" w:line="240" w:lineRule="auto"/>
+              <w:jc w:val="center"/>
+              <w:rPr>
+                <w:rFonts w:ascii="Times New Roman" w:eastAsia="Times New Roman" w:hAnsi="Times New Roman" w:cs="Times New Roman"/>
+                <w:b/>
+                <w:bCs/>
+                <w:sz w:val="24"/>
+                <w:szCs w:val="24"/>
+                <w:lang w:val="en-US"/>
+              </w:rPr>
+            </w:pPr>
+            <w:proofErr w:type="spellStart"/>
+            <w:r>
+              <w:rPr>
+                <w:rFonts w:ascii="Times New Roman" w:eastAsia="Times New Roman" w:hAnsi="Times New Roman" w:cs="Times New Roman"/>
+                <w:b/>
+                <w:bCs/>
+                <w:sz w:val="24"/>
+                <w:szCs w:val="24"/>
+                <w:lang w:val="en-US"/>
+              </w:rPr>
+              <w:t>Modelo</w:t>
+            </w:r>
+            <w:proofErr w:type="spellEnd"/>
+            <w:r>
+              <w:rPr>
+                <w:rFonts w:ascii="Times New Roman" w:eastAsia="Times New Roman" w:hAnsi="Times New Roman" w:cs="Times New Roman"/>
+                <w:b/>
+                <w:bCs/>
+                <w:sz w:val="24"/>
+                <w:szCs w:val="24"/>
+                <w:lang w:val="en-US"/>
+              </w:rPr>
+              <w:t xml:space="preserve"> </w:t>
+            </w:r>
+            <w:proofErr w:type="spellStart"/>
+            <w:r>
+              <w:rPr>
+                <w:rFonts w:ascii="Times New Roman" w:eastAsia="Times New Roman" w:hAnsi="Times New Roman" w:cs="Times New Roman"/>
+                <w:b/>
+                <w:bCs/>
+                <w:sz w:val="24"/>
+                <w:szCs w:val="24"/>
+                <w:lang w:val="en-US"/>
+              </w:rPr>
+              <w:t>preferido</w:t>
+            </w:r>
+            <w:proofErr w:type="spellEnd"/>
+          </w:p>
+        </w:tc>
+      </w:tr>
+      <w:tr>
+        <w:trPr>
+          <w:tblCellSpacing w:w="15" w:type="dxa"/>
+        </w:trPr>
+        <w:tc>
+          <w:tcPr>
+            <w:tcW w:w="0" w:type="auto"/>
+            <w:vAlign w:val="center"/>
+            <w:hideMark/>
+          </w:tcPr>
+          <w:p>
+            <w:pPr>
+              <w:spacing w:after="0" w:line="240" w:lineRule="auto"/>
+              <w:rPr>
+                <w:rFonts w:ascii="Times New Roman" w:eastAsia="Times New Roman" w:hAnsi="Times New Roman" w:cs="Times New Roman"/>
+                <w:sz w:val="24"/>
+                <w:szCs w:val="24"/>
+                <w:lang w:val="en-US"/>
+              </w:rPr>
+            </w:pPr>
+            <w:proofErr w:type="spellStart"/>
+            <w:r>
+              <w:rPr>
+                <w:rFonts w:ascii="Times New Roman" w:eastAsia="Times New Roman" w:hAnsi="Times New Roman" w:cs="Times New Roman"/>
+                <w:b/>
+                <w:bCs/>
+                <w:sz w:val="24"/>
+                <w:szCs w:val="24"/>
+                <w:lang w:val="en-US"/>
+              </w:rPr>
+              <w:t>Myrcia</w:t>
+            </w:r>
+            <w:proofErr w:type="spellEnd"/>
+          </w:p>
+        </w:tc>
+        <w:tc>
+          <w:tcPr>
+            <w:tcW w:w="0" w:type="auto"/>
+            <w:vAlign w:val="center"/>
+            <w:hideMark/>
+          </w:tcPr>
+          <w:p>
+            <w:pPr>
+              <w:spacing w:after="0" w:line="240" w:lineRule="auto"/>
+              <w:rPr>
+                <w:rFonts w:ascii="Times New Roman" w:eastAsia="Times New Roman" w:hAnsi="Times New Roman" w:cs="Times New Roman"/>
+                <w:sz w:val="24"/>
+                <w:szCs w:val="24"/>
+                <w:lang w:val="en-US"/>
+              </w:rPr>
+            </w:pPr>
+            <w:proofErr w:type="spellStart"/>
+            <w:r>
+              <w:rPr>
+                <w:rFonts w:ascii="Times New Roman" w:eastAsia="Times New Roman" w:hAnsi="Times New Roman" w:cs="Times New Roman"/>
+                <w:b/>
+                <w:bCs/>
+                <w:sz w:val="24"/>
+                <w:szCs w:val="24"/>
+                <w:lang w:val="en-US"/>
+              </w:rPr>
+              <w:t>logPmass</w:t>
+            </w:r>
+            <w:proofErr w:type="spellEnd"/>
+          </w:p>
+        </w:tc>
+        <w:tc>
+          <w:tcPr>
+            <w:tcW w:w="0" w:type="auto"/>
+            <w:vAlign w:val="center"/>
+            <w:hideMark/>
+          </w:tcPr>
+          <w:p>
+            <w:pPr>
+              <w:spacing w:after="0" w:line="240" w:lineRule="auto"/>
+              <w:rPr>
+                <w:rFonts w:ascii="Times New Roman" w:eastAsia="Times New Roman" w:hAnsi="Times New Roman" w:cs="Times New Roman"/>
+                <w:sz w:val="24"/>
+                <w:szCs w:val="24"/>
+                <w:lang w:val="en-US"/>
+              </w:rPr>
+            </w:pPr>
+            <w:r>
+              <w:rPr>
+                <w:rFonts w:ascii="Times New Roman" w:eastAsia="Times New Roman" w:hAnsi="Times New Roman" w:cs="Times New Roman"/>
+                <w:b/>
+                <w:bCs/>
+                <w:sz w:val="24"/>
+                <w:szCs w:val="24"/>
+                <w:lang w:val="en-US"/>
+              </w:rPr>
+              <w:t>−7.93</w:t>
+            </w:r>
+          </w:p>
+        </w:tc>
+        <w:tc>
+          <w:tcPr>
+            <w:tcW w:w="0" w:type="auto"/>
+            <w:vAlign w:val="center"/>
+            <w:hideMark/>
+          </w:tcPr>
+          <w:p>
+            <w:pPr>
+              <w:spacing w:after="0" w:line="240" w:lineRule="auto"/>
+              <w:rPr>
+                <w:rFonts w:ascii="Times New Roman" w:eastAsia="Times New Roman" w:hAnsi="Times New Roman" w:cs="Times New Roman"/>
+                <w:sz w:val="24"/>
+                <w:szCs w:val="24"/>
+                <w:lang w:val="en-US"/>
+              </w:rPr>
+            </w:pPr>
+            <w:r>
+              <w:rPr>
+                <w:rFonts w:ascii="Times New Roman" w:eastAsia="Times New Roman" w:hAnsi="Times New Roman" w:cs="Times New Roman"/>
+                <w:b/>
+                <w:bCs/>
+                <w:sz w:val="24"/>
+                <w:szCs w:val="24"/>
+                <w:lang w:val="en-US"/>
+              </w:rPr>
+              <w:t>10.52</w:t>
+            </w:r>
+          </w:p>
+        </w:tc>
+        <w:tc>
+          <w:tcPr>
+            <w:tcW w:w="0" w:type="auto"/>
+            <w:vAlign w:val="center"/>
+            <w:hideMark/>
+          </w:tcPr>
+          <w:p>
+            <w:pPr>
+              <w:spacing w:after="0" w:line="240" w:lineRule="auto"/>
+              <w:rPr>
+                <w:rFonts w:ascii="Times New Roman" w:eastAsia="Times New Roman" w:hAnsi="Times New Roman" w:cs="Times New Roman"/>
+                <w:sz w:val="24"/>
+                <w:szCs w:val="24"/>
+                <w:lang w:val="en-US"/>
+              </w:rPr>
+            </w:pPr>
+            <w:r>
+              <w:rPr>
+                <w:rFonts w:ascii="Times New Roman" w:eastAsia="Times New Roman" w:hAnsi="Times New Roman" w:cs="Times New Roman"/>
+                <w:b/>
+                <w:bCs/>
+                <w:sz w:val="24"/>
+                <w:szCs w:val="24"/>
+                <w:lang w:val="en-US"/>
+              </w:rPr>
+              <w:t>0.0012</w:t>
+            </w:r>
+          </w:p>
+        </w:tc>
+        <w:tc>
+          <w:tcPr>
+            <w:tcW w:w="0" w:type="auto"/>
+            <w:vAlign w:val="center"/>
+            <w:hideMark/>
+          </w:tcPr>
+          <w:p>
+            <w:pPr>
+              <w:spacing w:after="0" w:line="240" w:lineRule="auto"/>
+              <w:rPr>
+                <w:rFonts w:ascii="Times New Roman" w:eastAsia="Times New Roman" w:hAnsi="Times New Roman" w:cs="Times New Roman"/>
+                <w:sz w:val="24"/>
+                <w:szCs w:val="24"/>
+                <w:lang w:val="en-US"/>
+              </w:rPr>
+            </w:pPr>
+            <w:r>
+              <w:rPr>
+                <w:rFonts w:ascii="Times New Roman" w:eastAsia="Times New Roman" w:hAnsi="Times New Roman" w:cs="Times New Roman"/>
+                <w:b/>
+                <w:bCs/>
+                <w:sz w:val="24"/>
+                <w:szCs w:val="24"/>
+                <w:lang w:val="en-US"/>
+              </w:rPr>
+              <w:t>0.014</w:t>
+            </w:r>
+          </w:p>
+        </w:tc>
+        <w:tc>
+          <w:tcPr>
+            <w:tcW w:w="0" w:type="auto"/>
+            <w:vAlign w:val="center"/>
+            <w:hideMark/>
+          </w:tcPr>
+          <w:p>
+            <w:pPr>
+              <w:spacing w:after="0" w:line="240" w:lineRule="auto"/>
+              <w:rPr>
+                <w:rFonts w:ascii="Times New Roman" w:eastAsia="Times New Roman" w:hAnsi="Times New Roman" w:cs="Times New Roman"/>
+                <w:sz w:val="24"/>
+                <w:szCs w:val="24"/>
+                <w:lang w:val="en-US"/>
+              </w:rPr>
+            </w:pPr>
+            <w:proofErr w:type="spellStart"/>
+            <w:r>
+              <w:rPr>
+                <w:rFonts w:ascii="Times New Roman" w:eastAsia="Times New Roman" w:hAnsi="Times New Roman" w:cs="Times New Roman"/>
+                <w:b/>
+                <w:bCs/>
+                <w:sz w:val="24"/>
+                <w:szCs w:val="24"/>
+                <w:lang w:val="en-US"/>
+              </w:rPr>
+              <w:t>Interacción</w:t>
+            </w:r>
+            <w:proofErr w:type="spellEnd"/>
+          </w:p>
+        </w:tc>
+      </w:tr>
+      <w:tr>
+        <w:trPr>
+          <w:tblCellSpacing w:w="15" w:type="dxa"/>
+        </w:trPr>
+        <w:tc>
+          <w:tcPr>
+            <w:tcW w:w="0" w:type="auto"/>
+            <w:vAlign w:val="center"/>
+            <w:hideMark/>
+          </w:tcPr>
+          <w:p>
+            <w:pPr>
+              <w:spacing w:after="0" w:line="240" w:lineRule="auto"/>
+              <w:rPr>
+                <w:rFonts w:ascii="Times New Roman" w:eastAsia="Times New Roman" w:hAnsi="Times New Roman" w:cs="Times New Roman"/>
+                <w:sz w:val="24"/>
+                <w:szCs w:val="24"/>
+                <w:lang w:val="en-US"/>
+              </w:rPr>
+            </w:pPr>
+            <w:proofErr w:type="spellStart"/>
+            <w:r>
+              <w:rPr>
+                <w:rFonts w:ascii="Times New Roman" w:eastAsia="Times New Roman" w:hAnsi="Times New Roman" w:cs="Times New Roman"/>
+                <w:b/>
+                <w:bCs/>
+                <w:sz w:val="24"/>
+                <w:szCs w:val="24"/>
+                <w:lang w:val="en-US"/>
+              </w:rPr>
+              <w:t>Weinmania</w:t>
+            </w:r>
+            <w:proofErr w:type="spellEnd"/>
+          </w:p>
+        </w:tc>
+        <w:tc>
+          <w:tcPr>
+            <w:tcW w:w="0" w:type="auto"/>
+            <w:vAlign w:val="center"/>
+            <w:hideMark/>
+          </w:tcPr>
+          <w:p>
+            <w:pPr>
+              <w:spacing w:after="0" w:line="240" w:lineRule="auto"/>
+              <w:rPr>
+                <w:rFonts w:ascii="Times New Roman" w:eastAsia="Times New Roman" w:hAnsi="Times New Roman" w:cs="Times New Roman"/>
+                <w:sz w:val="24"/>
+                <w:szCs w:val="24"/>
+                <w:lang w:val="en-US"/>
+              </w:rPr>
+            </w:pPr>
+            <w:proofErr w:type="spellStart"/>
+            <w:r>
+              <w:rPr>
+                <w:rFonts w:ascii="Times New Roman" w:eastAsia="Times New Roman" w:hAnsi="Times New Roman" w:cs="Times New Roman"/>
+                <w:b/>
+                <w:bCs/>
+                <w:sz w:val="24"/>
+                <w:szCs w:val="24"/>
+                <w:lang w:val="en-US"/>
+              </w:rPr>
+              <w:t>logPmass</w:t>
+            </w:r>
+            <w:proofErr w:type="spellEnd"/>
+          </w:p>
+        </w:tc>
+        <w:tc>
+          <w:tcPr>
+            <w:tcW w:w="0" w:type="auto"/>
+            <w:vAlign w:val="center"/>
+            <w:hideMark/>
+          </w:tcPr>
+          <w:p>
+            <w:pPr>
+              <w:spacing w:after="0" w:line="240" w:lineRule="auto"/>
+              <w:rPr>
+                <w:rFonts w:ascii="Times New Roman" w:eastAsia="Times New Roman" w:hAnsi="Times New Roman" w:cs="Times New Roman"/>
+                <w:sz w:val="24"/>
+                <w:szCs w:val="24"/>
+                <w:lang w:val="en-US"/>
+              </w:rPr>
+            </w:pPr>
+            <w:r>
+              <w:rPr>
+                <w:rFonts w:ascii="Times New Roman" w:eastAsia="Times New Roman" w:hAnsi="Times New Roman" w:cs="Times New Roman"/>
+                <w:b/>
+                <w:bCs/>
+                <w:sz w:val="24"/>
+                <w:szCs w:val="24"/>
+                <w:lang w:val="en-US"/>
+              </w:rPr>
+              <w:t>−10.78</w:t>
+            </w:r>
+          </w:p>
+        </w:tc>
+        <w:tc>
+          <w:tcPr>
+            <w:tcW w:w="0" w:type="auto"/>
+            <w:vAlign w:val="center"/>
+            <w:hideMark/>
+          </w:tcPr>
+          <w:p>
+            <w:pPr>
+              <w:spacing w:after="0" w:line="240" w:lineRule="auto"/>
+              <w:rPr>
+                <w:rFonts w:ascii="Times New Roman" w:eastAsia="Times New Roman" w:hAnsi="Times New Roman" w:cs="Times New Roman"/>
+                <w:sz w:val="24"/>
+                <w:szCs w:val="24"/>
+                <w:lang w:val="en-US"/>
+              </w:rPr>
+            </w:pPr>
+            <w:r>
+              <w:rPr>
+                <w:rFonts w:ascii="Times New Roman" w:eastAsia="Times New Roman" w:hAnsi="Times New Roman" w:cs="Times New Roman"/>
+                <w:b/>
+                <w:bCs/>
+                <w:sz w:val="24"/>
+                <w:szCs w:val="24"/>
+                <w:lang w:val="en-US"/>
+              </w:rPr>
+              <w:t>15.42</w:t>
+            </w:r>
+          </w:p>
+        </w:tc>
+        <w:tc>
+          <w:tcPr>
+            <w:tcW w:w="0" w:type="auto"/>
+            <w:vAlign w:val="center"/>
+            <w:hideMark/>
+          </w:tcPr>
+          <w:p>
+            <w:pPr>
+              <w:spacing w:after="0" w:line="240" w:lineRule="auto"/>
+              <w:rPr>
+                <w:rFonts w:ascii="Times New Roman" w:eastAsia="Times New Roman" w:hAnsi="Times New Roman" w:cs="Times New Roman"/>
+                <w:sz w:val="24"/>
+                <w:szCs w:val="24"/>
+                <w:lang w:val="en-US"/>
+              </w:rPr>
+            </w:pPr>
+            <w:r>
+              <w:rPr>
+                <w:rFonts w:ascii="Times New Roman" w:eastAsia="Times New Roman" w:hAnsi="Times New Roman" w:cs="Times New Roman"/>
+                <w:b/>
+                <w:bCs/>
+                <w:sz w:val="24"/>
+                <w:szCs w:val="24"/>
+                <w:lang w:val="en-US"/>
+              </w:rPr>
+              <w:t>&lt;0.0001</w:t>
+            </w:r>
+          </w:p>
+        </w:tc>
+        <w:tc>
+          <w:tcPr>
+            <w:tcW w:w="0" w:type="auto"/>
+            <w:vAlign w:val="center"/>
+            <w:hideMark/>
+          </w:tcPr>
+          <w:p>
+            <w:pPr>
+              <w:spacing w:after="0" w:line="240" w:lineRule="auto"/>
+              <w:rPr>
+                <w:rFonts w:ascii="Times New Roman" w:eastAsia="Times New Roman" w:hAnsi="Times New Roman" w:cs="Times New Roman"/>
+                <w:sz w:val="24"/>
+                <w:szCs w:val="24"/>
+                <w:lang w:val="en-US"/>
+              </w:rPr>
+            </w:pPr>
+            <w:r>
+              <w:rPr>
+                <w:rFonts w:ascii="Times New Roman" w:eastAsia="Times New Roman" w:hAnsi="Times New Roman" w:cs="Times New Roman"/>
+                <w:b/>
+                <w:bCs/>
+                <w:sz w:val="24"/>
+                <w:szCs w:val="24"/>
+                <w:lang w:val="en-US"/>
+              </w:rPr>
+              <w:t>0.0021</w:t>
+            </w:r>
+          </w:p>
+        </w:tc>
+        <w:tc>
+          <w:tcPr>
+            <w:tcW w:w="0" w:type="auto"/>
+            <w:vAlign w:val="center"/>
+            <w:hideMark/>
+          </w:tcPr>
+          <w:p>
+            <w:pPr>
+              <w:spacing w:after="0" w:line="240" w:lineRule="auto"/>
+              <w:rPr>
+                <w:rFonts w:ascii="Times New Roman" w:eastAsia="Times New Roman" w:hAnsi="Times New Roman" w:cs="Times New Roman"/>
+                <w:sz w:val="24"/>
+                <w:szCs w:val="24"/>
+                <w:lang w:val="en-US"/>
+              </w:rPr>
+            </w:pPr>
+            <w:proofErr w:type="spellStart"/>
+            <w:r>
+              <w:rPr>
+                <w:rFonts w:ascii="Times New Roman" w:eastAsia="Times New Roman" w:hAnsi="Times New Roman" w:cs="Times New Roman"/>
+                <w:b/>
+                <w:bCs/>
+                <w:sz w:val="24"/>
+                <w:szCs w:val="24"/>
+                <w:lang w:val="en-US"/>
+              </w:rPr>
+              <w:t>Interacción</w:t>
+            </w:r>
+            <w:proofErr w:type="spellEnd"/>
+          </w:p>
+        </w:tc>
+      </w:tr>
+      <w:tr>
+        <w:trPr>
+          <w:tblCellSpacing w:w="15" w:type="dxa"/>
+        </w:trPr>
+        <w:tc>
+          <w:tcPr>
+            <w:tcW w:w="0" w:type="auto"/>
+            <w:vAlign w:val="center"/>
+            <w:hideMark/>
+          </w:tcPr>
+          <w:p>
+            <w:pPr>
+              <w:spacing w:after="0" w:line="240" w:lineRule="auto"/>
+              <w:rPr>
+                <w:rFonts w:ascii="Times New Roman" w:eastAsia="Times New Roman" w:hAnsi="Times New Roman" w:cs="Times New Roman"/>
+                <w:sz w:val="24"/>
+                <w:szCs w:val="24"/>
+                <w:lang w:val="en-US"/>
+              </w:rPr>
+            </w:pPr>
+            <w:proofErr w:type="spellStart"/>
+            <w:r>
+              <w:rPr>
+                <w:rFonts w:ascii="Times New Roman" w:eastAsia="Times New Roman" w:hAnsi="Times New Roman" w:cs="Times New Roman"/>
+                <w:sz w:val="24"/>
+                <w:szCs w:val="24"/>
+                <w:lang w:val="en-US"/>
+              </w:rPr>
+              <w:t>Pouteria</w:t>
+            </w:r>
+            <w:proofErr w:type="spellEnd"/>
+          </w:p>
+        </w:tc>
+        <w:tc>
+          <w:tcPr>
+            <w:tcW w:w="0" w:type="auto"/>
+            <w:vAlign w:val="center"/>
+            <w:hideMark/>
+          </w:tcPr>
+          <w:p>
+            <w:pPr>
+              <w:spacing w:after="0" w:line="240" w:lineRule="auto"/>
+              <w:rPr>
+                <w:rFonts w:ascii="Times New Roman" w:eastAsia="Times New Roman" w:hAnsi="Times New Roman" w:cs="Times New Roman"/>
+                <w:sz w:val="24"/>
+                <w:szCs w:val="24"/>
+                <w:lang w:val="en-US"/>
+              </w:rPr>
+            </w:pPr>
+            <w:proofErr w:type="spellStart"/>
+            <w:r>
+              <w:rPr>
+                <w:rFonts w:ascii="Times New Roman" w:eastAsia="Times New Roman" w:hAnsi="Times New Roman" w:cs="Times New Roman"/>
+                <w:sz w:val="24"/>
+                <w:szCs w:val="24"/>
+                <w:lang w:val="en-US"/>
+              </w:rPr>
+              <w:t>logCmass</w:t>
+            </w:r>
+            <w:proofErr w:type="spellEnd"/>
+            <w:r>
+              <w:rPr>
+                <w:rFonts w:ascii="Times New Roman" w:eastAsia="Times New Roman" w:hAnsi="Times New Roman" w:cs="Times New Roman"/>
+                <w:sz w:val="24"/>
+                <w:szCs w:val="24"/>
+                <w:lang w:val="en-US"/>
+              </w:rPr>
+              <w:t xml:space="preserve">, </w:t>
+            </w:r>
+            <w:proofErr w:type="spellStart"/>
+            <w:r>
+              <w:rPr>
+                <w:rFonts w:ascii="Times New Roman" w:eastAsia="Times New Roman" w:hAnsi="Times New Roman" w:cs="Times New Roman"/>
+                <w:sz w:val="24"/>
+                <w:szCs w:val="24"/>
+                <w:lang w:val="en-US"/>
+              </w:rPr>
+              <w:t>logNmass</w:t>
+            </w:r>
+            <w:proofErr w:type="spellEnd"/>
+            <w:r>
+              <w:rPr>
+                <w:rFonts w:ascii="Times New Roman" w:eastAsia="Times New Roman" w:hAnsi="Times New Roman" w:cs="Times New Roman"/>
+                <w:sz w:val="24"/>
+                <w:szCs w:val="24"/>
+                <w:lang w:val="en-US"/>
+              </w:rPr>
+              <w:t xml:space="preserve">, </w:t>
+            </w:r>
+            <w:proofErr w:type="spellStart"/>
+            <w:r>
+              <w:rPr>
+                <w:rFonts w:ascii="Times New Roman" w:eastAsia="Times New Roman" w:hAnsi="Times New Roman" w:cs="Times New Roman"/>
+                <w:sz w:val="24"/>
+                <w:szCs w:val="24"/>
+                <w:lang w:val="en-US"/>
+              </w:rPr>
+              <w:t>logPmass</w:t>
+            </w:r>
+            <w:proofErr w:type="spellEnd"/>
+            <w:r>
+              <w:rPr>
+                <w:rFonts w:ascii="Times New Roman" w:eastAsia="Times New Roman" w:hAnsi="Times New Roman" w:cs="Times New Roman"/>
+                <w:sz w:val="24"/>
+                <w:szCs w:val="24"/>
+                <w:lang w:val="en-US"/>
+              </w:rPr>
+              <w:t xml:space="preserve">, </w:t>
+            </w:r>
+            <w:proofErr w:type="spellStart"/>
+            <w:r>
+              <w:rPr>
+                <w:rFonts w:ascii="Times New Roman" w:eastAsia="Times New Roman" w:hAnsi="Times New Roman" w:cs="Times New Roman"/>
+                <w:sz w:val="24"/>
+                <w:szCs w:val="24"/>
+                <w:lang w:val="en-US"/>
+              </w:rPr>
+              <w:t>N_area</w:t>
+            </w:r>
+            <w:proofErr w:type="spellEnd"/>
+          </w:p>
+        </w:tc>
+        <w:tc>
+          <w:tcPr>
+            <w:tcW w:w="0" w:type="auto"/>
+            <w:vAlign w:val="center"/>
+            <w:hideMark/>
+          </w:tcPr>
+          <w:p>
+            <w:pPr>
+              <w:spacing w:after="0" w:line="240" w:lineRule="auto"/>
+              <w:rPr>
+                <w:rFonts w:ascii="Times New Roman" w:eastAsia="Times New Roman" w:hAnsi="Times New Roman" w:cs="Times New Roman"/>
+                <w:sz w:val="24"/>
+                <w:szCs w:val="24"/>
+                <w:lang w:val="en-US"/>
+              </w:rPr>
+            </w:pPr>
+            <w:r>
+              <w:rPr>
+                <w:rFonts w:ascii="Times New Roman" w:eastAsia="Times New Roman" w:hAnsi="Times New Roman" w:cs="Times New Roman"/>
+                <w:sz w:val="24"/>
+                <w:szCs w:val="24"/>
+                <w:lang w:val="en-US"/>
+              </w:rPr>
+              <w:t>+1.0 a +2.9</w:t>
+            </w:r>
+          </w:p>
+        </w:tc>
+        <w:tc>
+          <w:tcPr>
+            <w:tcW w:w="0" w:type="auto"/>
+            <w:vAlign w:val="center"/>
+            <w:hideMark/>
+          </w:tcPr>
+          <w:p>
+            <w:pPr>
+              <w:spacing w:after="0" w:line="240" w:lineRule="auto"/>
+              <w:rPr>
+                <w:rFonts w:ascii="Times New Roman" w:eastAsia="Times New Roman" w:hAnsi="Times New Roman" w:cs="Times New Roman"/>
+                <w:sz w:val="24"/>
+                <w:szCs w:val="24"/>
+                <w:lang w:val="en-US"/>
+              </w:rPr>
+            </w:pPr>
+            <w:r>
+              <w:rPr>
+                <w:rFonts w:ascii="Times New Roman" w:eastAsia="Times New Roman" w:hAnsi="Times New Roman" w:cs="Times New Roman"/>
+                <w:sz w:val="24"/>
+                <w:szCs w:val="24"/>
+                <w:lang w:val="en-US"/>
+              </w:rPr>
+              <w:t>0.02–1.9</w:t>
+            </w:r>
+          </w:p>
+        </w:tc>
+        <w:tc>
+          <w:tcPr>
+            <w:tcW w:w="0" w:type="auto"/>
+            <w:vAlign w:val="center"/>
+            <w:hideMark/>
+          </w:tcPr>
+          <w:p>
+            <w:pPr>
+              <w:spacing w:after="0" w:line="240" w:lineRule="auto"/>
+              <w:rPr>
+                <w:rFonts w:ascii="Times New Roman" w:eastAsia="Times New Roman" w:hAnsi="Times New Roman" w:cs="Times New Roman"/>
+                <w:sz w:val="24"/>
+                <w:szCs w:val="24"/>
+                <w:lang w:val="en-US"/>
+              </w:rPr>
+            </w:pPr>
+            <w:r>
+              <w:rPr>
+                <w:rFonts w:ascii="Times New Roman" w:eastAsia="Times New Roman" w:hAnsi="Times New Roman" w:cs="Times New Roman"/>
+                <w:sz w:val="24"/>
+                <w:szCs w:val="24"/>
+                <w:lang w:val="en-US"/>
+              </w:rPr>
+              <w:t>0.17–0.88</w:t>
+            </w:r>
+          </w:p>
+        </w:tc>
+        <w:tc>
+          <w:tcPr>
+            <w:tcW w:w="0" w:type="auto"/>
+            <w:vAlign w:val="center"/>
+            <w:hideMark/>
+          </w:tcPr>
+          <w:p>
+            <w:pPr>
+              <w:spacing w:after="0" w:line="240" w:lineRule="auto"/>
+              <w:rPr>
+                <w:rFonts w:ascii="Times New Roman" w:eastAsia="Times New Roman" w:hAnsi="Times New Roman" w:cs="Times New Roman"/>
+                <w:sz w:val="24"/>
+                <w:szCs w:val="24"/>
+                <w:lang w:val="en-US"/>
+              </w:rPr>
+            </w:pPr>
+            <w:r>
+              <w:rPr>
+                <w:rFonts w:ascii="Times New Roman" w:eastAsia="Times New Roman" w:hAnsi="Times New Roman" w:cs="Times New Roman"/>
+                <w:sz w:val="24"/>
+                <w:szCs w:val="24"/>
+                <w:lang w:val="en-US"/>
+              </w:rPr>
+              <w:t>0.51–0.88</w:t>
+            </w:r>
+          </w:p>
+        </w:tc>
+        <w:tc>
+          <w:tcPr>
+            <w:tcW w:w="0" w:type="auto"/>
+            <w:vAlign w:val="center"/>
+            <w:hideMark/>
+          </w:tcPr>
+          <w:p>
+            <w:pPr>
+              <w:spacing w:after="0" w:line="240" w:lineRule="auto"/>
+              <w:rPr>
+                <w:rFonts w:ascii="Times New Roman" w:eastAsia="Times New Roman" w:hAnsi="Times New Roman" w:cs="Times New Roman"/>
+                <w:sz w:val="24"/>
+                <w:szCs w:val="24"/>
+                <w:lang w:val="en-US"/>
+              </w:rPr>
+            </w:pPr>
+            <w:proofErr w:type="spellStart"/>
+            <w:r>
+              <w:rPr>
+                <w:rFonts w:ascii="Times New Roman" w:eastAsia="Times New Roman" w:hAnsi="Times New Roman" w:cs="Times New Roman"/>
+                <w:sz w:val="24"/>
+                <w:szCs w:val="24"/>
+                <w:lang w:val="en-US"/>
+              </w:rPr>
+              <w:t>Aditivo</w:t>
+            </w:r>
+            <w:proofErr w:type="spellEnd"/>
+            <w:r>
+              <w:rPr>
+                <w:rFonts w:ascii="Times New Roman" w:eastAsia="Times New Roman" w:hAnsi="Times New Roman" w:cs="Times New Roman"/>
+                <w:sz w:val="24"/>
+                <w:szCs w:val="24"/>
+                <w:lang w:val="en-US"/>
+              </w:rPr>
+              <w:t xml:space="preserve"> (las 4)</w:t>
+            </w:r>
+          </w:p>
+        </w:tc>
+      </w:tr>
+      <w:tr>
+        <w:trPr>
+          <w:tblCellSpacing w:w="15" w:type="dxa"/>
+        </w:trPr>
+        <w:tc>
+          <w:tcPr>
+            <w:tcW w:w="0" w:type="auto"/>
+            <w:vAlign w:val="center"/>
+            <w:hideMark/>
+          </w:tcPr>
+          <w:p>
+            <w:pPr>
+              <w:spacing w:after="0" w:line="240" w:lineRule="auto"/>
+              <w:rPr>
+                <w:rFonts w:ascii="Times New Roman" w:eastAsia="Times New Roman" w:hAnsi="Times New Roman" w:cs="Times New Roman"/>
+                <w:sz w:val="24"/>
+                <w:szCs w:val="24"/>
+                <w:lang w:val="en-US"/>
+              </w:rPr>
+            </w:pPr>
+            <w:proofErr w:type="spellStart"/>
+            <w:r>
+              <w:rPr>
+                <w:rFonts w:ascii="Times New Roman" w:eastAsia="Times New Roman" w:hAnsi="Times New Roman" w:cs="Times New Roman"/>
+                <w:sz w:val="24"/>
+                <w:szCs w:val="24"/>
+                <w:lang w:val="en-US"/>
+              </w:rPr>
+              <w:t>Clarisia</w:t>
+            </w:r>
+            <w:proofErr w:type="spellEnd"/>
+          </w:p>
+        </w:tc>
+        <w:tc>
+          <w:tcPr>
+            <w:tcW w:w="0" w:type="auto"/>
+            <w:vAlign w:val="center"/>
+            <w:hideMark/>
+          </w:tcPr>
+          <w:p>
+            <w:pPr>
+              <w:spacing w:after="0" w:line="240" w:lineRule="auto"/>
+              <w:rPr>
+                <w:rFonts w:ascii="Times New Roman" w:eastAsia="Times New Roman" w:hAnsi="Times New Roman" w:cs="Times New Roman"/>
+                <w:sz w:val="24"/>
+                <w:szCs w:val="24"/>
+                <w:lang w:val="en-US"/>
+              </w:rPr>
+            </w:pPr>
+            <w:r>
+              <w:rPr>
+                <w:rFonts w:ascii="Times New Roman" w:eastAsia="Times New Roman" w:hAnsi="Times New Roman" w:cs="Times New Roman"/>
+                <w:sz w:val="24"/>
+                <w:szCs w:val="24"/>
+                <w:lang w:val="en-US"/>
+              </w:rPr>
+              <w:t>las 4</w:t>
+            </w:r>
+          </w:p>
+        </w:tc>
+        <w:tc>
+          <w:tcPr>
+            <w:tcW w:w="0" w:type="auto"/>
+            <w:vAlign w:val="center"/>
+            <w:hideMark/>
+          </w:tcPr>
+          <w:p>
+            <w:pPr>
+              <w:spacing w:after="0" w:line="240" w:lineRule="auto"/>
+              <w:rPr>
+                <w:rFonts w:ascii="Times New Roman" w:eastAsia="Times New Roman" w:hAnsi="Times New Roman" w:cs="Times New Roman"/>
+                <w:sz w:val="24"/>
+                <w:szCs w:val="24"/>
+                <w:lang w:val="en-US"/>
+              </w:rPr>
+            </w:pPr>
+            <w:r>
+              <w:rPr>
+                <w:rFonts w:ascii="Times New Roman" w:eastAsia="Times New Roman" w:hAnsi="Times New Roman" w:cs="Times New Roman"/>
+                <w:sz w:val="24"/>
+                <w:szCs w:val="24"/>
+                <w:lang w:val="en-US"/>
+              </w:rPr>
+              <w:t>+4.7 a +8.7</w:t>
+            </w:r>
+          </w:p>
+        </w:tc>
+        <w:tc>
+          <w:tcPr>
+            <w:tcW w:w="0" w:type="auto"/>
+            <w:vAlign w:val="center"/>
+            <w:hideMark/>
+          </w:tcPr>
+          <w:p>
+            <w:pPr>
+              <w:spacing w:after="0" w:line="240" w:lineRule="auto"/>
+              <w:rPr>
+                <w:rFonts w:ascii="Times New Roman" w:eastAsia="Times New Roman" w:hAnsi="Times New Roman" w:cs="Times New Roman"/>
+                <w:sz w:val="24"/>
+                <w:szCs w:val="24"/>
+                <w:lang w:val="en-US"/>
+              </w:rPr>
+            </w:pPr>
+            <w:r>
+              <w:rPr>
+                <w:rFonts w:ascii="Times New Roman" w:eastAsia="Times New Roman" w:hAnsi="Times New Roman" w:cs="Times New Roman"/>
+                <w:sz w:val="24"/>
+                <w:szCs w:val="24"/>
+                <w:lang w:val="en-US"/>
+              </w:rPr>
+              <w:t>0.10–4.1</w:t>
+            </w:r>
+          </w:p>
+        </w:tc>
+        <w:tc>
+          <w:tcPr>
+            <w:tcW w:w="0" w:type="auto"/>
+            <w:vAlign w:val="center"/>
+            <w:hideMark/>
+          </w:tcPr>
+          <w:p>
+            <w:pPr>
+              <w:spacing w:after="0" w:line="240" w:lineRule="auto"/>
+              <w:rPr>
+                <w:rFonts w:ascii="Times New Roman" w:eastAsia="Times New Roman" w:hAnsi="Times New Roman" w:cs="Times New Roman"/>
+                <w:sz w:val="24"/>
+                <w:szCs w:val="24"/>
+                <w:lang w:val="en-US"/>
+              </w:rPr>
+            </w:pPr>
+            <w:r>
+              <w:rPr>
+                <w:rFonts w:ascii="Times New Roman" w:eastAsia="Times New Roman" w:hAnsi="Times New Roman" w:cs="Times New Roman"/>
+                <w:sz w:val="24"/>
+                <w:szCs w:val="24"/>
+                <w:lang w:val="en-US"/>
+              </w:rPr>
+              <w:t>0.04–0.75</w:t>
+            </w:r>
+          </w:p>
+        </w:tc>
+        <w:tc>
+          <w:tcPr>
+            <w:tcW w:w="0" w:type="auto"/>
+            <w:vAlign w:val="center"/>
+            <w:hideMark/>
+          </w:tcPr>
+          <w:p>
+            <w:pPr>
+              <w:spacing w:after="0" w:line="240" w:lineRule="auto"/>
+              <w:rPr>
+                <w:rFonts w:ascii="Times New Roman" w:eastAsia="Times New Roman" w:hAnsi="Times New Roman" w:cs="Times New Roman"/>
+                <w:sz w:val="24"/>
+                <w:szCs w:val="24"/>
+                <w:lang w:val="en-US"/>
+              </w:rPr>
+            </w:pPr>
+            <w:r>
+              <w:rPr>
+                <w:rFonts w:ascii="Times New Roman" w:eastAsia="Times New Roman" w:hAnsi="Times New Roman" w:cs="Times New Roman"/>
+                <w:sz w:val="24"/>
+                <w:szCs w:val="24"/>
+                <w:lang w:val="en-US"/>
+              </w:rPr>
+              <w:t>0.34–0.82</w:t>
+            </w:r>
+          </w:p>
+        </w:tc>
+        <w:tc>
+          <w:tcPr>
+            <w:tcW w:w="0" w:type="auto"/>
+            <w:vAlign w:val="center"/>
+            <w:hideMark/>
+          </w:tcPr>
+          <w:p>
+            <w:pPr>
+              <w:spacing w:after="0" w:line="240" w:lineRule="auto"/>
+              <w:rPr>
+                <w:rFonts w:ascii="Times New Roman" w:eastAsia="Times New Roman" w:hAnsi="Times New Roman" w:cs="Times New Roman"/>
+                <w:sz w:val="24"/>
+                <w:szCs w:val="24"/>
+                <w:lang w:val="en-US"/>
+              </w:rPr>
+            </w:pPr>
+            <w:proofErr w:type="spellStart"/>
+            <w:r>
+              <w:rPr>
+                <w:rFonts w:ascii="Times New Roman" w:eastAsia="Times New Roman" w:hAnsi="Times New Roman" w:cs="Times New Roman"/>
+                <w:sz w:val="24"/>
+                <w:szCs w:val="24"/>
+                <w:lang w:val="en-US"/>
+              </w:rPr>
+              <w:t>Aditivo</w:t>
+            </w:r>
+            <w:proofErr w:type="spellEnd"/>
+            <w:r>
+              <w:rPr>
+                <w:rFonts w:ascii="Times New Roman" w:eastAsia="Times New Roman" w:hAnsi="Times New Roman" w:cs="Times New Roman"/>
+                <w:sz w:val="24"/>
+                <w:szCs w:val="24"/>
+                <w:lang w:val="en-US"/>
+              </w:rPr>
+              <w:t xml:space="preserve"> (las 4)</w:t>
+            </w:r>
+          </w:p>
+        </w:tc>
+      </w:tr>
+      <w:tr>
+        <w:trPr>
+          <w:tblCellSpacing w:w="15" w:type="dxa"/>
+        </w:trPr>
+        <w:tc>
+          <w:tcPr>
+            <w:tcW w:w="0" w:type="auto"/>
+            <w:vAlign w:val="center"/>
+            <w:hideMark/>
+          </w:tcPr>
+          <w:p>
+            <w:pPr>
+              <w:spacing w:after="0" w:line="240" w:lineRule="auto"/>
+              <w:rPr>
+                <w:rFonts w:ascii="Times New Roman" w:eastAsia="Times New Roman" w:hAnsi="Times New Roman" w:cs="Times New Roman"/>
+                <w:sz w:val="24"/>
+                <w:szCs w:val="24"/>
+                <w:lang w:val="en-US"/>
+              </w:rPr>
+            </w:pPr>
+            <w:proofErr w:type="spellStart"/>
+            <w:r>
+              <w:rPr>
+                <w:rFonts w:ascii="Times New Roman" w:eastAsia="Times New Roman" w:hAnsi="Times New Roman" w:cs="Times New Roman"/>
+                <w:sz w:val="24"/>
+                <w:szCs w:val="24"/>
+                <w:lang w:val="en-US"/>
+              </w:rPr>
+              <w:t>Alchornea</w:t>
+            </w:r>
+            <w:proofErr w:type="spellEnd"/>
+          </w:p>
+        </w:tc>
+        <w:tc>
+          <w:tcPr>
+            <w:tcW w:w="0" w:type="auto"/>
+            <w:vAlign w:val="center"/>
+            <w:hideMark/>
+          </w:tcPr>
+          <w:p>
+            <w:pPr>
+              <w:spacing w:after="0" w:line="240" w:lineRule="auto"/>
+              <w:rPr>
+                <w:rFonts w:ascii="Times New Roman" w:eastAsia="Times New Roman" w:hAnsi="Times New Roman" w:cs="Times New Roman"/>
+                <w:sz w:val="24"/>
+                <w:szCs w:val="24"/>
+                <w:lang w:val="en-US"/>
+              </w:rPr>
+            </w:pPr>
+            <w:r>
+              <w:rPr>
+                <w:rFonts w:ascii="Times New Roman" w:eastAsia="Times New Roman" w:hAnsi="Times New Roman" w:cs="Times New Roman"/>
+                <w:sz w:val="24"/>
+                <w:szCs w:val="24"/>
+                <w:lang w:val="en-US"/>
+              </w:rPr>
+              <w:t>las 4</w:t>
+            </w:r>
+          </w:p>
+        </w:tc>
+        <w:tc>
+          <w:tcPr>
+            <w:tcW w:w="0" w:type="auto"/>
+            <w:vAlign w:val="center"/>
+            <w:hideMark/>
+          </w:tcPr>
+          <w:p>
+            <w:pPr>
+              <w:spacing w:after="0" w:line="240" w:lineRule="auto"/>
+              <w:rPr>
+                <w:rFonts w:ascii="Times New Roman" w:eastAsia="Times New Roman" w:hAnsi="Times New Roman" w:cs="Times New Roman"/>
+                <w:sz w:val="24"/>
+                <w:szCs w:val="24"/>
+                <w:lang w:val="en-US"/>
+              </w:rPr>
+            </w:pPr>
+            <w:r>
+              <w:rPr>
+                <w:rFonts w:ascii="Times New Roman" w:eastAsia="Times New Roman" w:hAnsi="Times New Roman" w:cs="Times New Roman"/>
+                <w:sz w:val="24"/>
+                <w:szCs w:val="24"/>
+                <w:lang w:val="en-US"/>
+              </w:rPr>
+              <w:t>+1.4 a +2.6</w:t>
+            </w:r>
+          </w:p>
+        </w:tc>
+        <w:tc>
+          <w:tcPr>
+            <w:tcW w:w="0" w:type="auto"/>
+            <w:vAlign w:val="center"/>
+            <w:hideMark/>
+          </w:tcPr>
+          <w:p>
+            <w:pPr>
+              <w:spacing w:after="0" w:line="240" w:lineRule="auto"/>
+              <w:rPr>
+                <w:rFonts w:ascii="Times New Roman" w:eastAsia="Times New Roman" w:hAnsi="Times New Roman" w:cs="Times New Roman"/>
+                <w:sz w:val="24"/>
+                <w:szCs w:val="24"/>
+                <w:lang w:val="en-US"/>
+              </w:rPr>
+            </w:pPr>
+            <w:r>
+              <w:rPr>
+                <w:rFonts w:ascii="Times New Roman" w:eastAsia="Times New Roman" w:hAnsi="Times New Roman" w:cs="Times New Roman"/>
+                <w:sz w:val="24"/>
+                <w:szCs w:val="24"/>
+                <w:lang w:val="en-US"/>
+              </w:rPr>
+              <w:t>0.03–1.3</w:t>
+            </w:r>
+          </w:p>
+        </w:tc>
+        <w:tc>
+          <w:tcPr>
+            <w:tcW w:w="0" w:type="auto"/>
+            <w:vAlign w:val="center"/>
+            <w:hideMark/>
+          </w:tcPr>
+          <w:p>
+            <w:pPr>
+              <w:spacing w:after="0" w:line="240" w:lineRule="auto"/>
+              <w:rPr>
+                <w:rFonts w:ascii="Times New Roman" w:eastAsia="Times New Roman" w:hAnsi="Times New Roman" w:cs="Times New Roman"/>
+                <w:sz w:val="24"/>
+                <w:szCs w:val="24"/>
+                <w:lang w:val="en-US"/>
+              </w:rPr>
+            </w:pPr>
+            <w:r>
+              <w:rPr>
+                <w:rFonts w:ascii="Times New Roman" w:eastAsia="Times New Roman" w:hAnsi="Times New Roman" w:cs="Times New Roman"/>
+                <w:sz w:val="24"/>
+                <w:szCs w:val="24"/>
+                <w:lang w:val="en-US"/>
+              </w:rPr>
+              <w:t>0.26–0.87</w:t>
+            </w:r>
+          </w:p>
+        </w:tc>
+        <w:tc>
+          <w:tcPr>
+            <w:tcW w:w="0" w:type="auto"/>
+            <w:vAlign w:val="center"/>
+            <w:hideMark/>
+          </w:tcPr>
+          <w:p>
+            <w:pPr>
+              <w:spacing w:after="0" w:line="240" w:lineRule="auto"/>
+              <w:rPr>
+                <w:rFonts w:ascii="Times New Roman" w:eastAsia="Times New Roman" w:hAnsi="Times New Roman" w:cs="Times New Roman"/>
+                <w:sz w:val="24"/>
+                <w:szCs w:val="24"/>
+                <w:lang w:val="en-US"/>
+              </w:rPr>
+            </w:pPr>
+            <w:r>
+              <w:rPr>
+                <w:rFonts w:ascii="Times New Roman" w:eastAsia="Times New Roman" w:hAnsi="Times New Roman" w:cs="Times New Roman"/>
+                <w:sz w:val="24"/>
+                <w:szCs w:val="24"/>
+                <w:lang w:val="en-US"/>
+              </w:rPr>
+              <w:t>0.57–0.88</w:t>
+            </w:r>
+          </w:p>
+        </w:tc>
+        <w:tc>
+          <w:tcPr>
+            <w:tcW w:w="0" w:type="auto"/>
+            <w:vAlign w:val="center"/>
+            <w:hideMark/>
+          </w:tcPr>
+          <w:p>
+            <w:pPr>
+              <w:spacing w:after="0" w:line="240" w:lineRule="auto"/>
+              <w:rPr>
+                <w:rFonts w:ascii="Times New Roman" w:eastAsia="Times New Roman" w:hAnsi="Times New Roman" w:cs="Times New Roman"/>
+                <w:sz w:val="24"/>
+                <w:szCs w:val="24"/>
+                <w:lang w:val="en-US"/>
+              </w:rPr>
+            </w:pPr>
+            <w:proofErr w:type="spellStart"/>
+            <w:r>
+              <w:rPr>
+                <w:rFonts w:ascii="Times New Roman" w:eastAsia="Times New Roman" w:hAnsi="Times New Roman" w:cs="Times New Roman"/>
+                <w:sz w:val="24"/>
+                <w:szCs w:val="24"/>
+                <w:lang w:val="en-US"/>
+              </w:rPr>
+              <w:t>Aditivo</w:t>
+            </w:r>
+            <w:proofErr w:type="spellEnd"/>
+            <w:r>
+              <w:rPr>
+                <w:rFonts w:ascii="Times New Roman" w:eastAsia="Times New Roman" w:hAnsi="Times New Roman" w:cs="Times New Roman"/>
+                <w:sz w:val="24"/>
+                <w:szCs w:val="24"/>
+                <w:lang w:val="en-US"/>
+              </w:rPr>
+              <w:t xml:space="preserve"> (las 4)</w:t>
+            </w:r>
+          </w:p>
+        </w:tc>
+      </w:tr>
+      <w:tr>
+        <w:trPr>
+          <w:tblCellSpacing w:w="15" w:type="dxa"/>
+        </w:trPr>
+        <w:tc>
+          <w:tcPr>
+            <w:tcW w:w="0" w:type="auto"/>
+            <w:vAlign w:val="center"/>
+            <w:hideMark/>
+          </w:tcPr>
+          <w:p>
+            <w:pPr>
+              <w:spacing w:after="0" w:line="240" w:lineRule="auto"/>
+              <w:rPr>
+                <w:rFonts w:ascii="Times New Roman" w:eastAsia="Times New Roman" w:hAnsi="Times New Roman" w:cs="Times New Roman"/>
+                <w:sz w:val="24"/>
+                <w:szCs w:val="24"/>
+                <w:lang w:val="en-US"/>
+              </w:rPr>
+            </w:pPr>
+            <w:proofErr w:type="spellStart"/>
+            <w:r>
+              <w:rPr>
+                <w:rFonts w:ascii="Times New Roman" w:eastAsia="Times New Roman" w:hAnsi="Times New Roman" w:cs="Times New Roman"/>
+                <w:sz w:val="24"/>
+                <w:szCs w:val="24"/>
+                <w:lang w:val="en-US"/>
+              </w:rPr>
+              <w:t>Myrcia</w:t>
+            </w:r>
+            <w:proofErr w:type="spellEnd"/>
+          </w:p>
+        </w:tc>
+        <w:tc>
+          <w:tcPr>
+            <w:tcW w:w="0" w:type="auto"/>
+            <w:vAlign w:val="center"/>
+            <w:hideMark/>
+          </w:tcPr>
+          <w:p>
+            <w:pPr>
+              <w:spacing w:after="0" w:line="240" w:lineRule="auto"/>
+              <w:rPr>
+                <w:rFonts w:ascii="Times New Roman" w:eastAsia="Times New Roman" w:hAnsi="Times New Roman" w:cs="Times New Roman"/>
+                <w:sz w:val="24"/>
+                <w:szCs w:val="24"/>
+                <w:lang w:val="en-US"/>
+              </w:rPr>
+            </w:pPr>
+            <w:proofErr w:type="spellStart"/>
+            <w:r>
+              <w:rPr>
+                <w:rFonts w:ascii="Times New Roman" w:eastAsia="Times New Roman" w:hAnsi="Times New Roman" w:cs="Times New Roman"/>
+                <w:sz w:val="24"/>
+                <w:szCs w:val="24"/>
+                <w:lang w:val="en-US"/>
+              </w:rPr>
+              <w:t>logCmass</w:t>
+            </w:r>
+            <w:proofErr w:type="spellEnd"/>
+            <w:r>
+              <w:rPr>
+                <w:rFonts w:ascii="Times New Roman" w:eastAsia="Times New Roman" w:hAnsi="Times New Roman" w:cs="Times New Roman"/>
+                <w:sz w:val="24"/>
+                <w:szCs w:val="24"/>
+                <w:lang w:val="en-US"/>
+              </w:rPr>
+              <w:t xml:space="preserve">, </w:t>
+            </w:r>
+            <w:proofErr w:type="spellStart"/>
+            <w:r>
+              <w:rPr>
+                <w:rFonts w:ascii="Times New Roman" w:eastAsia="Times New Roman" w:hAnsi="Times New Roman" w:cs="Times New Roman"/>
+                <w:sz w:val="24"/>
+                <w:szCs w:val="24"/>
+                <w:lang w:val="en-US"/>
+              </w:rPr>
+              <w:t>logNmass</w:t>
+            </w:r>
+            <w:proofErr w:type="spellEnd"/>
+            <w:r>
+              <w:rPr>
+                <w:rFonts w:ascii="Times New Roman" w:eastAsia="Times New Roman" w:hAnsi="Times New Roman" w:cs="Times New Roman"/>
+                <w:sz w:val="24"/>
+                <w:szCs w:val="24"/>
+                <w:lang w:val="en-US"/>
+              </w:rPr>
+              <w:t xml:space="preserve">, </w:t>
+            </w:r>
+            <w:proofErr w:type="spellStart"/>
+            <w:r>
+              <w:rPr>
+                <w:rFonts w:ascii="Times New Roman" w:eastAsia="Times New Roman" w:hAnsi="Times New Roman" w:cs="Times New Roman"/>
+                <w:sz w:val="24"/>
+                <w:szCs w:val="24"/>
+                <w:lang w:val="en-US"/>
+              </w:rPr>
+              <w:t>N_area</w:t>
+            </w:r>
+            <w:proofErr w:type="spellEnd"/>
+          </w:p>
+        </w:tc>
+        <w:tc>
+          <w:tcPr>
+            <w:tcW w:w="0" w:type="auto"/>
+            <w:vAlign w:val="center"/>
+            <w:hideMark/>
+          </w:tcPr>
+          <w:p>
+            <w:pPr>
+              <w:spacing w:after="0" w:line="240" w:lineRule="auto"/>
+              <w:rPr>
+                <w:rFonts w:ascii="Times New Roman" w:eastAsia="Times New Roman" w:hAnsi="Times New Roman" w:cs="Times New Roman"/>
+                <w:sz w:val="24"/>
+                <w:szCs w:val="24"/>
+                <w:lang w:val="en-US"/>
+              </w:rPr>
+            </w:pPr>
+            <w:r>
+              <w:rPr>
+                <w:rFonts w:ascii="Times New Roman" w:eastAsia="Times New Roman" w:hAnsi="Times New Roman" w:cs="Times New Roman"/>
+                <w:sz w:val="24"/>
+                <w:szCs w:val="24"/>
+                <w:lang w:val="en-US"/>
+              </w:rPr>
+              <w:t>+2.0 a +2.2</w:t>
+            </w:r>
+          </w:p>
+        </w:tc>
+        <w:tc>
+          <w:tcPr>
+            <w:tcW w:w="0" w:type="auto"/>
+            <w:vAlign w:val="center"/>
+            <w:hideMark/>
+          </w:tcPr>
+          <w:p>
+            <w:pPr>
+              <w:spacing w:after="0" w:line="240" w:lineRule="auto"/>
+              <w:rPr>
+                <w:rFonts w:ascii="Times New Roman" w:eastAsia="Times New Roman" w:hAnsi="Times New Roman" w:cs="Times New Roman"/>
+                <w:sz w:val="24"/>
+                <w:szCs w:val="24"/>
+                <w:lang w:val="en-US"/>
+              </w:rPr>
+            </w:pPr>
+            <w:r>
+              <w:rPr>
+                <w:rFonts w:ascii="Times New Roman" w:eastAsia="Times New Roman" w:hAnsi="Times New Roman" w:cs="Times New Roman"/>
+                <w:sz w:val="24"/>
+                <w:szCs w:val="24"/>
+                <w:lang w:val="en-US"/>
+              </w:rPr>
+              <w:t>0.4–0.6</w:t>
+            </w:r>
+          </w:p>
+        </w:tc>
+        <w:tc>
+          <w:tcPr>
+            <w:tcW w:w="0" w:type="auto"/>
+            <w:vAlign w:val="center"/>
+            <w:hideMark/>
+          </w:tcPr>
+          <w:p>
+            <w:pPr>
+              <w:spacing w:after="0" w:line="240" w:lineRule="auto"/>
+              <w:rPr>
+                <w:rFonts w:ascii="Times New Roman" w:eastAsia="Times New Roman" w:hAnsi="Times New Roman" w:cs="Times New Roman"/>
+                <w:sz w:val="24"/>
+                <w:szCs w:val="24"/>
+                <w:lang w:val="en-US"/>
+              </w:rPr>
+            </w:pPr>
+            <w:r>
+              <w:rPr>
+                <w:rFonts w:ascii="Times New Roman" w:eastAsia="Times New Roman" w:hAnsi="Times New Roman" w:cs="Times New Roman"/>
+                <w:sz w:val="24"/>
+                <w:szCs w:val="24"/>
+                <w:lang w:val="en-US"/>
+              </w:rPr>
+              <w:t>0.43–0.53</w:t>
+            </w:r>
+          </w:p>
+        </w:tc>
+        <w:tc>
+          <w:tcPr>
+            <w:tcW w:w="0" w:type="auto"/>
+            <w:vAlign w:val="center"/>
+            <w:hideMark/>
+          </w:tcPr>
+          <w:p>
+            <w:pPr>
+              <w:spacing w:after="0" w:line="240" w:lineRule="auto"/>
+              <w:rPr>
+                <w:rFonts w:ascii="Times New Roman" w:eastAsia="Times New Roman" w:hAnsi="Times New Roman" w:cs="Times New Roman"/>
+                <w:sz w:val="24"/>
+                <w:szCs w:val="24"/>
+                <w:lang w:val="en-US"/>
+              </w:rPr>
+            </w:pPr>
+            <w:r>
+              <w:rPr>
+                <w:rFonts w:ascii="Times New Roman" w:eastAsia="Times New Roman" w:hAnsi="Times New Roman" w:cs="Times New Roman"/>
+                <w:sz w:val="24"/>
+                <w:szCs w:val="24"/>
+                <w:lang w:val="en-US"/>
+              </w:rPr>
+              <w:t>0.69</w:t>
+            </w:r>
+          </w:p>
+        </w:tc>
+        <w:tc>
+          <w:tcPr>
+            <w:tcW w:w="0" w:type="auto"/>
+            <w:vAlign w:val="center"/>
+            <w:hideMark/>
+          </w:tcPr>
+          <w:p>
+            <w:pPr>
+              <w:spacing w:after="0" w:line="240" w:lineRule="auto"/>
+              <w:rPr>
+                <w:rFonts w:ascii="Times New Roman" w:eastAsia="Times New Roman" w:hAnsi="Times New Roman" w:cs="Times New Roman"/>
+                <w:sz w:val="24"/>
+                <w:szCs w:val="24"/>
+                <w:lang w:val="en-US"/>
+              </w:rPr>
+            </w:pPr>
+            <w:proofErr w:type="spellStart"/>
+            <w:r>
+              <w:rPr>
+                <w:rFonts w:ascii="Times New Roman" w:eastAsia="Times New Roman" w:hAnsi="Times New Roman" w:cs="Times New Roman"/>
+                <w:sz w:val="24"/>
+                <w:szCs w:val="24"/>
+                <w:lang w:val="en-US"/>
+              </w:rPr>
+              <w:t>Aditivo</w:t>
+            </w:r>
+            <w:proofErr w:type="spellEnd"/>
+          </w:p>
+        </w:tc>
+      </w:tr>
+      <w:tr>
+        <w:trPr>
+          <w:tblCellSpacing w:w="15" w:type="dxa"/>
+        </w:trPr>
+        <w:tc>
+          <w:tcPr>
+            <w:tcW w:w="0" w:type="auto"/>
+            <w:vAlign w:val="center"/>
+            <w:hideMark/>
+          </w:tcPr>
+          <w:p>
+            <w:pPr>
+              <w:spacing w:after="0" w:line="240" w:lineRule="auto"/>
+              <w:rPr>
+                <w:rFonts w:ascii="Times New Roman" w:eastAsia="Times New Roman" w:hAnsi="Times New Roman" w:cs="Times New Roman"/>
+                <w:sz w:val="24"/>
+                <w:szCs w:val="24"/>
+                <w:lang w:val="en-US"/>
+              </w:rPr>
+            </w:pPr>
+            <w:proofErr w:type="spellStart"/>
+            <w:r>
+              <w:rPr>
+                <w:rFonts w:ascii="Times New Roman" w:eastAsia="Times New Roman" w:hAnsi="Times New Roman" w:cs="Times New Roman"/>
+                <w:sz w:val="24"/>
+                <w:szCs w:val="24"/>
+                <w:lang w:val="en-US"/>
+              </w:rPr>
+              <w:t>Hedyosmum</w:t>
+            </w:r>
+            <w:proofErr w:type="spellEnd"/>
+          </w:p>
+        </w:tc>
+        <w:tc>
+          <w:tcPr>
+            <w:tcW w:w="0" w:type="auto"/>
+            <w:vAlign w:val="center"/>
+            <w:hideMark/>
+          </w:tcPr>
+          <w:p>
+            <w:pPr>
+              <w:spacing w:after="0" w:line="240" w:lineRule="auto"/>
+              <w:rPr>
+                <w:rFonts w:ascii="Times New Roman" w:eastAsia="Times New Roman" w:hAnsi="Times New Roman" w:cs="Times New Roman"/>
+                <w:sz w:val="24"/>
+                <w:szCs w:val="24"/>
+                <w:lang w:val="en-US"/>
+              </w:rPr>
+            </w:pPr>
+            <w:r>
+              <w:rPr>
+                <w:rFonts w:ascii="Times New Roman" w:eastAsia="Times New Roman" w:hAnsi="Times New Roman" w:cs="Times New Roman"/>
+                <w:sz w:val="24"/>
+                <w:szCs w:val="24"/>
+                <w:lang w:val="en-US"/>
+              </w:rPr>
+              <w:t>las 4</w:t>
+            </w:r>
+          </w:p>
+        </w:tc>
+        <w:tc>
+          <w:tcPr>
+            <w:tcW w:w="0" w:type="auto"/>
+            <w:vAlign w:val="center"/>
+            <w:hideMark/>
+          </w:tcPr>
+          <w:p>
+            <w:pPr>
+              <w:spacing w:after="0" w:line="240" w:lineRule="auto"/>
+              <w:rPr>
+                <w:rFonts w:ascii="Times New Roman" w:eastAsia="Times New Roman" w:hAnsi="Times New Roman" w:cs="Times New Roman"/>
+                <w:sz w:val="24"/>
+                <w:szCs w:val="24"/>
+                <w:lang w:val="en-US"/>
+              </w:rPr>
+            </w:pPr>
+            <w:r>
+              <w:rPr>
+                <w:rFonts w:ascii="Times New Roman" w:eastAsia="Times New Roman" w:hAnsi="Times New Roman" w:cs="Times New Roman"/>
+                <w:sz w:val="24"/>
+                <w:szCs w:val="24"/>
+                <w:lang w:val="en-US"/>
+              </w:rPr>
+              <w:t>+1.9 a +3.5</w:t>
+            </w:r>
+          </w:p>
+        </w:tc>
+        <w:tc>
+          <w:tcPr>
+            <w:tcW w:w="0" w:type="auto"/>
+            <w:vAlign w:val="center"/>
+            <w:hideMark/>
+          </w:tcPr>
+          <w:p>
+            <w:pPr>
+              <w:spacing w:after="0" w:line="240" w:lineRule="auto"/>
+              <w:rPr>
+                <w:rFonts w:ascii="Times New Roman" w:eastAsia="Times New Roman" w:hAnsi="Times New Roman" w:cs="Times New Roman"/>
+                <w:sz w:val="24"/>
+                <w:szCs w:val="24"/>
+                <w:lang w:val="en-US"/>
+              </w:rPr>
+            </w:pPr>
+            <w:r>
+              <w:rPr>
+                <w:rFonts w:ascii="Times New Roman" w:eastAsia="Times New Roman" w:hAnsi="Times New Roman" w:cs="Times New Roman"/>
+                <w:sz w:val="24"/>
+                <w:szCs w:val="24"/>
+                <w:lang w:val="en-US"/>
+              </w:rPr>
+              <w:t>0.55–2.1</w:t>
+            </w:r>
+          </w:p>
+        </w:tc>
+        <w:tc>
+          <w:tcPr>
+            <w:tcW w:w="0" w:type="auto"/>
+            <w:vAlign w:val="center"/>
+            <w:hideMark/>
+          </w:tcPr>
+          <w:p>
+            <w:pPr>
+              <w:spacing w:after="0" w:line="240" w:lineRule="auto"/>
+              <w:rPr>
+                <w:rFonts w:ascii="Times New Roman" w:eastAsia="Times New Roman" w:hAnsi="Times New Roman" w:cs="Times New Roman"/>
+                <w:sz w:val="24"/>
+                <w:szCs w:val="24"/>
+                <w:lang w:val="en-US"/>
+              </w:rPr>
+            </w:pPr>
+            <w:r>
+              <w:rPr>
+                <w:rFonts w:ascii="Times New Roman" w:eastAsia="Times New Roman" w:hAnsi="Times New Roman" w:cs="Times New Roman"/>
+                <w:sz w:val="24"/>
+                <w:szCs w:val="24"/>
+                <w:lang w:val="en-US"/>
+              </w:rPr>
+              <w:t>0.15–0.46</w:t>
+            </w:r>
+          </w:p>
+        </w:tc>
+        <w:tc>
+          <w:tcPr>
+            <w:tcW w:w="0" w:type="auto"/>
+            <w:vAlign w:val="center"/>
+            <w:hideMark/>
+          </w:tcPr>
+          <w:p>
+            <w:pPr>
+              <w:spacing w:after="0" w:line="240" w:lineRule="auto"/>
+              <w:rPr>
+                <w:rFonts w:ascii="Times New Roman" w:eastAsia="Times New Roman" w:hAnsi="Times New Roman" w:cs="Times New Roman"/>
+                <w:sz w:val="24"/>
+                <w:szCs w:val="24"/>
+                <w:lang w:val="en-US"/>
+              </w:rPr>
+            </w:pPr>
+            <w:r>
+              <w:rPr>
+                <w:rFonts w:ascii="Times New Roman" w:eastAsia="Times New Roman" w:hAnsi="Times New Roman" w:cs="Times New Roman"/>
+                <w:sz w:val="24"/>
+                <w:szCs w:val="24"/>
+                <w:lang w:val="en-US"/>
+              </w:rPr>
+              <w:t>0.51–0.69</w:t>
+            </w:r>
+          </w:p>
+        </w:tc>
+        <w:tc>
+          <w:tcPr>
+            <w:tcW w:w="0" w:type="auto"/>
+            <w:vAlign w:val="center"/>
+            <w:hideMark/>
+          </w:tcPr>
+          <w:p>
+            <w:pPr>
+              <w:spacing w:after="0" w:line="240" w:lineRule="auto"/>
+              <w:rPr>
+                <w:rFonts w:ascii="Times New Roman" w:eastAsia="Times New Roman" w:hAnsi="Times New Roman" w:cs="Times New Roman"/>
+                <w:sz w:val="24"/>
+                <w:szCs w:val="24"/>
+                <w:lang w:val="en-US"/>
+              </w:rPr>
+            </w:pPr>
+            <w:proofErr w:type="spellStart"/>
+            <w:r>
+              <w:rPr>
+                <w:rFonts w:ascii="Times New Roman" w:eastAsia="Times New Roman" w:hAnsi="Times New Roman" w:cs="Times New Roman"/>
+                <w:sz w:val="24"/>
+                <w:szCs w:val="24"/>
+                <w:lang w:val="en-US"/>
+              </w:rPr>
+              <w:t>Aditivo</w:t>
+            </w:r>
+            <w:proofErr w:type="spellEnd"/>
+            <w:r>
+              <w:rPr>
+                <w:rFonts w:ascii="Times New Roman" w:eastAsia="Times New Roman" w:hAnsi="Times New Roman" w:cs="Times New Roman"/>
+                <w:sz w:val="24"/>
+                <w:szCs w:val="24"/>
+                <w:lang w:val="en-US"/>
+              </w:rPr>
+              <w:t xml:space="preserve"> (las 4)</w:t>
+            </w:r>
+          </w:p>
+        </w:tc>
+      </w:tr>
+      <w:tr>
+        <w:trPr>
+          <w:tblCellSpacing w:w="15" w:type="dxa"/>
+        </w:trPr>
+        <w:tc>
+          <w:tcPr>
+            <w:tcW w:w="0" w:type="auto"/>
+            <w:vAlign w:val="center"/>
+            <w:hideMark/>
+          </w:tcPr>
+          <w:p>
+            <w:pPr>
+              <w:spacing w:after="0" w:line="240" w:lineRule="auto"/>
+              <w:rPr>
+                <w:rFonts w:ascii="Times New Roman" w:eastAsia="Times New Roman" w:hAnsi="Times New Roman" w:cs="Times New Roman"/>
+                <w:sz w:val="24"/>
+                <w:szCs w:val="24"/>
+                <w:lang w:val="en-US"/>
+              </w:rPr>
+            </w:pPr>
+            <w:proofErr w:type="spellStart"/>
+            <w:r>
+              <w:rPr>
+                <w:rFonts w:ascii="Times New Roman" w:eastAsia="Times New Roman" w:hAnsi="Times New Roman" w:cs="Times New Roman"/>
+                <w:sz w:val="24"/>
+                <w:szCs w:val="24"/>
+                <w:lang w:val="en-US"/>
+              </w:rPr>
+              <w:t>Weinmania</w:t>
+            </w:r>
+            <w:proofErr w:type="spellEnd"/>
+          </w:p>
+        </w:tc>
+        <w:tc>
+          <w:tcPr>
+            <w:tcW w:w="0" w:type="auto"/>
+            <w:vAlign w:val="center"/>
+            <w:hideMark/>
+          </w:tcPr>
+          <w:p>
+            <w:pPr>
+              <w:spacing w:after="0" w:line="240" w:lineRule="auto"/>
+              <w:rPr>
+                <w:rFonts w:ascii="Times New Roman" w:eastAsia="Times New Roman" w:hAnsi="Times New Roman" w:cs="Times New Roman"/>
+                <w:sz w:val="24"/>
+                <w:szCs w:val="24"/>
+                <w:lang w:val="en-US"/>
+              </w:rPr>
+            </w:pPr>
+            <w:proofErr w:type="spellStart"/>
+            <w:r>
+              <w:rPr>
+                <w:rFonts w:ascii="Times New Roman" w:eastAsia="Times New Roman" w:hAnsi="Times New Roman" w:cs="Times New Roman"/>
+                <w:sz w:val="24"/>
+                <w:szCs w:val="24"/>
+                <w:lang w:val="en-US"/>
+              </w:rPr>
+              <w:t>logCmass</w:t>
+            </w:r>
+            <w:proofErr w:type="spellEnd"/>
+            <w:r>
+              <w:rPr>
+                <w:rFonts w:ascii="Times New Roman" w:eastAsia="Times New Roman" w:hAnsi="Times New Roman" w:cs="Times New Roman"/>
+                <w:sz w:val="24"/>
+                <w:szCs w:val="24"/>
+                <w:lang w:val="en-US"/>
+              </w:rPr>
+              <w:t xml:space="preserve">, </w:t>
+            </w:r>
+            <w:proofErr w:type="spellStart"/>
+            <w:r>
+              <w:rPr>
+                <w:rFonts w:ascii="Times New Roman" w:eastAsia="Times New Roman" w:hAnsi="Times New Roman" w:cs="Times New Roman"/>
+                <w:sz w:val="24"/>
+                <w:szCs w:val="24"/>
+                <w:lang w:val="en-US"/>
+              </w:rPr>
+              <w:t>logNmass</w:t>
+            </w:r>
+            <w:proofErr w:type="spellEnd"/>
+            <w:r>
+              <w:rPr>
+                <w:rFonts w:ascii="Times New Roman" w:eastAsia="Times New Roman" w:hAnsi="Times New Roman" w:cs="Times New Roman"/>
+                <w:sz w:val="24"/>
+                <w:szCs w:val="24"/>
+                <w:lang w:val="en-US"/>
+              </w:rPr>
+              <w:t xml:space="preserve">, </w:t>
+            </w:r>
+            <w:proofErr w:type="spellStart"/>
+            <w:r>
+              <w:rPr>
+                <w:rFonts w:ascii="Times New Roman" w:eastAsia="Times New Roman" w:hAnsi="Times New Roman" w:cs="Times New Roman"/>
+                <w:sz w:val="24"/>
+                <w:szCs w:val="24"/>
+                <w:lang w:val="en-US"/>
+              </w:rPr>
+              <w:t>N_area</w:t>
+            </w:r>
+            <w:proofErr w:type="spellEnd"/>
+          </w:p>
+        </w:tc>
+        <w:tc>
+          <w:tcPr>
+            <w:tcW w:w="0" w:type="auto"/>
+            <w:vAlign w:val="center"/>
+            <w:hideMark/>
+          </w:tcPr>
+          <w:p>
+            <w:pPr>
+              <w:spacing w:after="0" w:line="240" w:lineRule="auto"/>
+              <w:rPr>
+                <w:rFonts w:ascii="Times New Roman" w:eastAsia="Times New Roman" w:hAnsi="Times New Roman" w:cs="Times New Roman"/>
+                <w:sz w:val="24"/>
+                <w:szCs w:val="24"/>
+                <w:lang w:val="en-US"/>
+              </w:rPr>
+            </w:pPr>
+            <w:r>
+              <w:rPr>
+                <w:rFonts w:ascii="Times New Roman" w:eastAsia="Times New Roman" w:hAnsi="Times New Roman" w:cs="Times New Roman"/>
+                <w:sz w:val="24"/>
+                <w:szCs w:val="24"/>
+                <w:lang w:val="en-US"/>
+              </w:rPr>
+              <w:t>+1.7 a +4.5</w:t>
+            </w:r>
+          </w:p>
+        </w:tc>
+        <w:tc>
+          <w:tcPr>
+            <w:tcW w:w="0" w:type="auto"/>
+            <w:vAlign w:val="center"/>
+            <w:hideMark/>
+          </w:tcPr>
+          <w:p>
+            <w:pPr>
+              <w:spacing w:after="0" w:line="240" w:lineRule="auto"/>
+              <w:rPr>
+                <w:rFonts w:ascii="Times New Roman" w:eastAsia="Times New Roman" w:hAnsi="Times New Roman" w:cs="Times New Roman"/>
+                <w:sz w:val="24"/>
+                <w:szCs w:val="24"/>
+                <w:lang w:val="en-US"/>
+              </w:rPr>
+            </w:pPr>
+            <w:r>
+              <w:rPr>
+                <w:rFonts w:ascii="Times New Roman" w:eastAsia="Times New Roman" w:hAnsi="Times New Roman" w:cs="Times New Roman"/>
+                <w:sz w:val="24"/>
+                <w:szCs w:val="24"/>
+                <w:lang w:val="en-US"/>
+              </w:rPr>
+              <w:t>0.10–3.0</w:t>
+            </w:r>
+          </w:p>
+        </w:tc>
+        <w:tc>
+          <w:tcPr>
+            <w:tcW w:w="0" w:type="auto"/>
+            <w:vAlign w:val="center"/>
+            <w:hideMark/>
+          </w:tcPr>
+          <w:p>
+            <w:pPr>
+              <w:spacing w:after="0" w:line="240" w:lineRule="auto"/>
+              <w:rPr>
+                <w:rFonts w:ascii="Times New Roman" w:eastAsia="Times New Roman" w:hAnsi="Times New Roman" w:cs="Times New Roman"/>
+                <w:sz w:val="24"/>
+                <w:szCs w:val="24"/>
+                <w:lang w:val="en-US"/>
+              </w:rPr>
+            </w:pPr>
+            <w:r>
+              <w:rPr>
+                <w:rFonts w:ascii="Times New Roman" w:eastAsia="Times New Roman" w:hAnsi="Times New Roman" w:cs="Times New Roman"/>
+                <w:sz w:val="24"/>
+                <w:szCs w:val="24"/>
+                <w:lang w:val="en-US"/>
+              </w:rPr>
+              <w:t>0.09–0.75</w:t>
+            </w:r>
+          </w:p>
+        </w:tc>
+        <w:tc>
+          <w:tcPr>
+            <w:tcW w:w="0" w:type="auto"/>
+            <w:vAlign w:val="center"/>
+            <w:hideMark/>
+          </w:tcPr>
+          <w:p>
+            <w:pPr>
+              <w:spacing w:after="0" w:line="240" w:lineRule="auto"/>
+              <w:rPr>
+                <w:rFonts w:ascii="Times New Roman" w:eastAsia="Times New Roman" w:hAnsi="Times New Roman" w:cs="Times New Roman"/>
+                <w:sz w:val="24"/>
+                <w:szCs w:val="24"/>
+                <w:lang w:val="en-US"/>
+              </w:rPr>
+            </w:pPr>
+            <w:r>
+              <w:rPr>
+                <w:rFonts w:ascii="Times New Roman" w:eastAsia="Times New Roman" w:hAnsi="Times New Roman" w:cs="Times New Roman"/>
+                <w:sz w:val="24"/>
+                <w:szCs w:val="24"/>
+                <w:lang w:val="en-US"/>
+              </w:rPr>
+              <w:t>0.51–0.</w:t>
+            </w:r>
+            <w:bookmarkStart w:id="0" w:name="_GoBack"/>
+            <w:bookmarkEnd w:id="0"/>
+            <w:r>
+              <w:rPr>
+                <w:rFonts w:ascii="Times New Roman" w:eastAsia="Times New Roman" w:hAnsi="Times New Roman" w:cs="Times New Roman"/>
+                <w:sz w:val="24"/>
+                <w:szCs w:val="24"/>
+                <w:lang w:val="en-US"/>
+              </w:rPr>
+              <w:t>82</w:t>
+            </w:r>
+          </w:p>
+        </w:tc>
+        <w:tc>
+          <w:tcPr>
+            <w:tcW w:w="0" w:type="auto"/>
+            <w:vAlign w:val="center"/>
+            <w:hideMark/>
+          </w:tcPr>
+          <w:p>
+            <w:pPr>
+              <w:spacing w:after="0" w:line="240" w:lineRule="auto"/>
+              <w:rPr>
+                <w:rFonts w:ascii="Times New Roman" w:eastAsia="Times New Roman" w:hAnsi="Times New Roman" w:cs="Times New Roman"/>
+                <w:sz w:val="24"/>
+                <w:szCs w:val="24"/>
+                <w:lang w:val="en-US"/>
+              </w:rPr>
+            </w:pPr>
+            <w:proofErr w:type="spellStart"/>
+            <w:r>
+              <w:rPr>
+                <w:rFonts w:ascii="Times New Roman" w:eastAsia="Times New Roman" w:hAnsi="Times New Roman" w:cs="Times New Roman"/>
+                <w:sz w:val="24"/>
+                <w:szCs w:val="24"/>
+                <w:lang w:val="en-US"/>
+              </w:rPr>
+              <w:t>Aditivo</w:t>
+            </w:r>
+            <w:proofErr w:type="spellEnd"/>
+          </w:p>
+        </w:tc>
+      </w:tr>
+    </w:tbl>
+    <w:p>
+      <w:pPr>
+        <w:rPr>
+          <w:lang w:val="en-US"/>
+        </w:rPr>
+      </w:pPr>
+      <w:r>
+        <w:rPr>
+          <w:lang w:val="en-US"/>
+        </w:rPr>
+        <w:br w:type="textWrapping" w:clear="all"/>
+      </w:r>
     </w:p>
     <w:sectPr>
       <w:pgSz w:w="12240" w:h="15840"/>
@@ -717,6 +2924,26 @@
     <w:name w:val="Normal"/>
     <w:qFormat/>
   </w:style>
+  <w:style w:type="paragraph" w:styleId="Ttulo3">
+    <w:name w:val="heading 3"/>
+    <w:basedOn w:val="Normal"/>
+    <w:link w:val="Ttulo3Car"/>
+    <w:uiPriority w:val="9"/>
+    <w:qFormat/>
+    <w:rsid w:val="00515C9A"/>
+    <w:pPr>
+      <w:spacing w:before="100" w:beforeAutospacing="1" w:after="100" w:afterAutospacing="1" w:line="240" w:lineRule="auto"/>
+      <w:outlineLvl w:val="2"/>
+    </w:pPr>
+    <w:rPr>
+      <w:rFonts w:ascii="Times New Roman" w:eastAsia="Times New Roman" w:hAnsi="Times New Roman" w:cs="Times New Roman"/>
+      <w:b/>
+      <w:bCs/>
+      <w:sz w:val="27"/>
+      <w:szCs w:val="27"/>
+      <w:lang w:val="en-US"/>
+    </w:rPr>
+  </w:style>
   <w:style w:type="character" w:default="1" w:styleId="Fuentedeprrafopredeter">
     <w:name w:val="Default Paragraph Font"/>
     <w:uiPriority w:val="1"/>
@@ -758,6 +2985,32 @@
     <w:name w:val="eop"/>
     <w:basedOn w:val="Fuentedeprrafopredeter"/>
     <w:rsid w:val="00461403"/>
+  </w:style>
+  <w:style w:type="character" w:customStyle="1" w:styleId="Ttulo3Car">
+    <w:name w:val="Título 3 Car"/>
+    <w:basedOn w:val="Fuentedeprrafopredeter"/>
+    <w:link w:val="Ttulo3"/>
+    <w:uiPriority w:val="9"/>
+    <w:rsid w:val="00515C9A"/>
+    <w:rPr>
+      <w:rFonts w:ascii="Times New Roman" w:eastAsia="Times New Roman" w:hAnsi="Times New Roman" w:cs="Times New Roman"/>
+      <w:b/>
+      <w:bCs/>
+      <w:sz w:val="27"/>
+      <w:szCs w:val="27"/>
+      <w:lang w:val="en-US"/>
+    </w:rPr>
+  </w:style>
+  <w:style w:type="character" w:styleId="Textoennegrita">
+    <w:name w:val="Strong"/>
+    <w:basedOn w:val="Fuentedeprrafopredeter"/>
+    <w:uiPriority w:val="22"/>
+    <w:qFormat/>
+    <w:rsid w:val="00515C9A"/>
+    <w:rPr>
+      <w:b/>
+      <w:bCs/>
+    </w:rPr>
   </w:style>
 </w:styles>
 </file>

</xml_diff>